<commit_message>
Aktualizace souboru CV ke stažení na novější verzi
Co-Authored-By: Claude Opus 4.8 (1M context) <noreply@anthropic.com>
</commit_message>
<xml_diff>
--- a/public/images/Dagmar_Drbalkova_CV.docx
+++ b/public/images/Dagmar_Drbalkova_CV.docx
@@ -47,7 +47,7 @@
             <w:r>
               <w:drawing>
                 <wp:inline distT="0" distB="0" distL="0" distR="0">
-                  <wp:extent cx="1123950" cy="1123950"/>
+                  <wp:extent cx="1409700" cy="1762125"/>
                   <wp:effectExtent t="0" r="0" b="0" l="0"/>
                   <wp:docPr id="1" name="" descr="" title=""/>
                   <wp:cNvGraphicFramePr>
@@ -72,7 +72,7 @@
                         <pic:spPr bwMode="auto">
                           <a:xfrm>
                             <a:off x="0" y="0"/>
-                            <a:ext cx="1123950" cy="1123950"/>
+                            <a:ext cx="1409700" cy="1762125"/>
                           </a:xfrm>
                           <a:prstGeom prst="rect">
                             <a:avLst/>
@@ -142,7 +142,7 @@
               </w:rPr>
               <w:t xml:space="preserve">Email  </w:t>
             </w:r>
-            <w:hyperlink w:history="1" r:id="rIdspe7u2tsrargfj-xgufcq">
+            <w:hyperlink w:history="1" r:id="rId0rwo5lgrzqgdftonz4mio">
               <w:r>
                 <w:rPr>
                   <w:rFonts w:ascii="Calibri" w:cs="Calibri" w:eastAsia="Calibri" w:hAnsi="Calibri"/>
@@ -195,7 +195,7 @@
               </w:rPr>
               <w:t xml:space="preserve">GitHub  </w:t>
             </w:r>
-            <w:hyperlink w:history="1" r:id="rIdayifl5kbgm7fpcddiit83">
+            <w:hyperlink w:history="1" r:id="rIdeu_fmq_1cag6gdwmqlwxm">
               <w:r>
                 <w:rPr>
                   <w:rFonts w:ascii="Calibri" w:cs="Calibri" w:eastAsia="Calibri" w:hAnsi="Calibri"/>
@@ -223,7 +223,7 @@
               </w:rPr>
               <w:t xml:space="preserve">LinkedIn  </w:t>
             </w:r>
-            <w:hyperlink w:history="1" r:id="rIdrbrg0lrpcoo-y7w6fofzo">
+            <w:hyperlink w:history="1" r:id="rIdxyl_h8lk0yqgaunvis7p9">
               <w:r>
                 <w:rPr>
                   <w:rFonts w:ascii="Calibri" w:cs="Calibri" w:eastAsia="Calibri" w:hAnsi="Calibri"/>
@@ -251,7 +251,7 @@
               </w:rPr>
               <w:t xml:space="preserve">Portfolio  </w:t>
             </w:r>
-            <w:hyperlink w:history="1" r:id="rIdzuyjjn_astyxzjmmrsg3e">
+            <w:hyperlink w:history="1" r:id="rIdpfll2r0gnlkkbdilc32gs">
               <w:r>
                 <w:rPr>
                   <w:rFonts w:ascii="Calibri" w:cs="Calibri" w:eastAsia="Calibri" w:hAnsi="Calibri"/>
@@ -868,7 +868,7 @@
           </w:p>
           <w:tbl>
             <w:tblPr>
-              <w:tblW w:type="dxa" w:w="9350"/>
+              <w:tblW w:type="dxa" w:w="7360"/>
               <w:tblBorders>
                 <w:top w:val="none" w:color="FFFFFF" w:sz="0"/>
                 <w:left w:val="none" w:color="FFFFFF" w:sz="0"/>
@@ -879,15 +879,15 @@
               </w:tblBorders>
             </w:tblPr>
             <w:tblGrid>
-              <w:gridCol w:w="2320"/>
-              <w:gridCol w:w="2320"/>
-              <w:gridCol w:w="2320"/>
-              <w:gridCol w:w="2320"/>
+              <w:gridCol w:w="1840"/>
+              <w:gridCol w:w="1840"/>
+              <w:gridCol w:w="1840"/>
+              <w:gridCol w:w="1840"/>
             </w:tblGrid>
             <w:tr>
               <w:tc>
                 <w:tcPr>
-                  <w:tcW w:type="dxa" w:w="2320"/>
+                  <w:tcW w:type="dxa" w:w="1840"/>
                   <w:tcBorders>
                     <w:top w:val="single" w:color="D9D9D9" w:sz="4"/>
                     <w:left w:val="single" w:color="D9D9D9" w:sz="4"/>
@@ -933,7 +933,7 @@
               </w:tc>
               <w:tc>
                 <w:tcPr>
-                  <w:tcW w:type="dxa" w:w="2320"/>
+                  <w:tcW w:type="dxa" w:w="1840"/>
                   <w:tcBorders>
                     <w:top w:val="single" w:color="D9D9D9" w:sz="4"/>
                     <w:left w:val="single" w:color="D9D9D9" w:sz="4"/>
@@ -979,7 +979,7 @@
               </w:tc>
               <w:tc>
                 <w:tcPr>
-                  <w:tcW w:type="dxa" w:w="2320"/>
+                  <w:tcW w:type="dxa" w:w="1840"/>
                   <w:tcBorders>
                     <w:top w:val="single" w:color="D9D9D9" w:sz="4"/>
                     <w:left w:val="single" w:color="D9D9D9" w:sz="4"/>
@@ -1025,7 +1025,7 @@
               </w:tc>
               <w:tc>
                 <w:tcPr>
-                  <w:tcW w:type="dxa" w:w="2320"/>
+                  <w:tcW w:type="dxa" w:w="1840"/>
                   <w:tcBorders>
                     <w:top w:val="single" w:color="D9D9D9" w:sz="4"/>
                     <w:left w:val="single" w:color="D9D9D9" w:sz="4"/>
@@ -1078,7 +1078,7 @@
           </w:p>
           <w:tbl>
             <w:tblPr>
-              <w:tblW w:type="dxa" w:w="9350"/>
+              <w:tblW w:type="dxa" w:w="7360"/>
               <w:tblBorders>
                 <w:top w:val="none" w:color="FFFFFF" w:sz="0"/>
                 <w:left w:val="none" w:color="FFFFFF" w:sz="0"/>
@@ -1089,15 +1089,15 @@
               </w:tblBorders>
             </w:tblPr>
             <w:tblGrid>
-              <w:gridCol w:w="2320"/>
-              <w:gridCol w:w="2320"/>
-              <w:gridCol w:w="2320"/>
-              <w:gridCol w:w="2320"/>
+              <w:gridCol w:w="1840"/>
+              <w:gridCol w:w="1840"/>
+              <w:gridCol w:w="1840"/>
+              <w:gridCol w:w="1840"/>
             </w:tblGrid>
             <w:tr>
               <w:tc>
                 <w:tcPr>
-                  <w:tcW w:type="dxa" w:w="2320"/>
+                  <w:tcW w:type="dxa" w:w="1840"/>
                   <w:tcBorders>
                     <w:top w:val="single" w:color="D9D9D9" w:sz="4"/>
                     <w:left w:val="single" w:color="D9D9D9" w:sz="4"/>
@@ -1143,7 +1143,7 @@
               </w:tc>
               <w:tc>
                 <w:tcPr>
-                  <w:tcW w:type="dxa" w:w="2320"/>
+                  <w:tcW w:type="dxa" w:w="1840"/>
                   <w:tcBorders>
                     <w:top w:val="single" w:color="D9D9D9" w:sz="4"/>
                     <w:left w:val="single" w:color="D9D9D9" w:sz="4"/>
@@ -1189,7 +1189,7 @@
               </w:tc>
               <w:tc>
                 <w:tcPr>
-                  <w:tcW w:type="dxa" w:w="2320"/>
+                  <w:tcW w:type="dxa" w:w="1840"/>
                   <w:tcBorders>
                     <w:top w:val="single" w:color="D9D9D9" w:sz="4"/>
                     <w:left w:val="single" w:color="D9D9D9" w:sz="4"/>
@@ -1235,7 +1235,7 @@
               </w:tc>
               <w:tc>
                 <w:tcPr>
-                  <w:tcW w:type="dxa" w:w="2320"/>
+                  <w:tcW w:type="dxa" w:w="1840"/>
                   <w:tcBorders>
                     <w:top w:val="single" w:color="D9D9D9" w:sz="4"/>
                     <w:left w:val="single" w:color="D9D9D9" w:sz="4"/>
@@ -1360,7 +1360,7 @@
           <w:p>
             <w:pPr>
               <w:tabs>
-                <w:tab w:val="right" w:pos="9360"/>
+                <w:tab w:val="right" w:pos="7271"/>
               </w:tabs>
               <w:spacing w:after="20" w:before="120"/>
             </w:pPr>
@@ -1484,7 +1484,7 @@
           <w:p>
             <w:pPr>
               <w:tabs>
-                <w:tab w:val="right" w:pos="9360"/>
+                <w:tab w:val="right" w:pos="7271"/>
               </w:tabs>
               <w:spacing w:after="20" w:before="120"/>
             </w:pPr>
@@ -1552,7 +1552,7 @@
           <w:p>
             <w:pPr>
               <w:tabs>
-                <w:tab w:val="right" w:pos="9360"/>
+                <w:tab w:val="right" w:pos="7271"/>
               </w:tabs>
               <w:spacing w:after="20" w:before="120"/>
             </w:pPr>
@@ -1582,7 +1582,7 @@
           <w:p>
             <w:pPr>
               <w:tabs>
-                <w:tab w:val="right" w:pos="9360"/>
+                <w:tab w:val="right" w:pos="7271"/>
               </w:tabs>
               <w:spacing w:after="20" w:before="120"/>
             </w:pPr>
@@ -1630,7 +1630,7 @@
           <w:p>
             <w:pPr>
               <w:tabs>
-                <w:tab w:val="right" w:pos="9360"/>
+                <w:tab w:val="right" w:pos="7271"/>
               </w:tabs>
               <w:spacing w:after="20" w:before="120"/>
             </w:pPr>
@@ -1655,6 +1655,52 @@
                 <w:szCs w:val="19"/>
               </w:rPr>
               <w:t xml:space="preserve">	Jan – Mar 2024</w:t>
+            </w:r>
+          </w:p>
+          <w:p>
+            <w:pPr>
+              <w:spacing w:before="500"/>
+              <w:jc w:val="right"/>
+            </w:pPr>
+            <w:r>
+              <w:drawing>
+                <wp:inline distT="0" distB="0" distL="0" distR="0">
+                  <wp:extent cx="2238375" cy="1838325"/>
+                  <wp:effectExtent t="0" r="0" b="0" l="0"/>
+                  <wp:docPr id="1" name="" descr="" title=""/>
+                  <wp:cNvGraphicFramePr>
+                    <a:graphicFrameLocks xmlns:a="http://schemas.openxmlformats.org/drawingml/2006/main" noChangeAspect="1"/>
+                  </wp:cNvGraphicFramePr>
+                  <a:graphic xmlns:a="http://schemas.openxmlformats.org/drawingml/2006/main">
+                    <a:graphicData uri="http://schemas.openxmlformats.org/drawingml/2006/picture">
+                      <pic:pic xmlns:pic="http://schemas.openxmlformats.org/drawingml/2006/picture">
+                        <pic:nvPicPr>
+                          <pic:cNvPr id="0" name="" descr=""/>
+                          <pic:cNvPicPr>
+                            <a:picLocks noChangeAspect="1" noChangeArrowheads="1"/>
+                          </pic:cNvPicPr>
+                        </pic:nvPicPr>
+                        <pic:blipFill>
+                          <a:blip r:embed="rId8" cstate="none"/>
+                          <a:srcRect/>
+                          <a:stretch>
+                            <a:fillRect/>
+                          </a:stretch>
+                        </pic:blipFill>
+                        <pic:spPr bwMode="auto">
+                          <a:xfrm>
+                            <a:off x="0" y="0"/>
+                            <a:ext cx="2238375" cy="1838325"/>
+                          </a:xfrm>
+                          <a:prstGeom prst="rect">
+                            <a:avLst/>
+                          </a:prstGeom>
+                        </pic:spPr>
+                      </pic:pic>
+                    </a:graphicData>
+                  </a:graphic>
+                </wp:inline>
+              </w:drawing>
             </w:r>
           </w:p>
         </w:tc>

</xml_diff>

<commit_message>
Aktualizace souboru CV ke stažení na finální verzi
Co-Authored-By: Claude Opus 4.8 (1M context) <noreply@anthropic.com>
</commit_message>
<xml_diff>
--- a/public/images/Dagmar_Drbalkova_CV.docx
+++ b/public/images/Dagmar_Drbalkova_CV.docx
@@ -142,7 +142,7 @@
               </w:rPr>
               <w:t xml:space="preserve">Email  </w:t>
             </w:r>
-            <w:hyperlink w:history="1" r:id="rId0rwo5lgrzqgdftonz4mio">
+            <w:hyperlink w:history="1" r:id="rIdnqacn6xic_tlov2_cwoev">
               <w:r>
                 <w:rPr>
                   <w:rFonts w:ascii="Calibri" w:cs="Calibri" w:eastAsia="Calibri" w:hAnsi="Calibri"/>
@@ -195,7 +195,7 @@
               </w:rPr>
               <w:t xml:space="preserve">GitHub  </w:t>
             </w:r>
-            <w:hyperlink w:history="1" r:id="rIdeu_fmq_1cag6gdwmqlwxm">
+            <w:hyperlink w:history="1" r:id="rId2m4tgqorquiqx42qa5img">
               <w:r>
                 <w:rPr>
                   <w:rFonts w:ascii="Calibri" w:cs="Calibri" w:eastAsia="Calibri" w:hAnsi="Calibri"/>
@@ -223,7 +223,7 @@
               </w:rPr>
               <w:t xml:space="preserve">LinkedIn  </w:t>
             </w:r>
-            <w:hyperlink w:history="1" r:id="rIdxyl_h8lk0yqgaunvis7p9">
+            <w:hyperlink w:history="1" r:id="rIdeb07ciyfawrncerngbapu">
               <w:r>
                 <w:rPr>
                   <w:rFonts w:ascii="Calibri" w:cs="Calibri" w:eastAsia="Calibri" w:hAnsi="Calibri"/>
@@ -251,7 +251,7 @@
               </w:rPr>
               <w:t xml:space="preserve">Portfolio  </w:t>
             </w:r>
-            <w:hyperlink w:history="1" r:id="rIdpfll2r0gnlkkbdilc32gs">
+            <w:hyperlink w:history="1" r:id="rIdxubg-zpqimfyy8t4gcgn-">
               <w:r>
                 <w:rPr>
                   <w:rFonts w:ascii="Calibri" w:cs="Calibri" w:eastAsia="Calibri" w:hAnsi="Calibri"/>
@@ -1665,7 +1665,7 @@
             <w:r>
               <w:drawing>
                 <wp:inline distT="0" distB="0" distL="0" distR="0">
-                  <wp:extent cx="2238375" cy="1838325"/>
+                  <wp:extent cx="1857375" cy="1628775"/>
                   <wp:effectExtent t="0" r="0" b="0" l="0"/>
                   <wp:docPr id="1" name="" descr="" title=""/>
                   <wp:cNvGraphicFramePr>
@@ -1690,7 +1690,7 @@
                         <pic:spPr bwMode="auto">
                           <a:xfrm>
                             <a:off x="0" y="0"/>
-                            <a:ext cx="2238375" cy="1838325"/>
+                            <a:ext cx="1857375" cy="1628775"/>
                           </a:xfrm>
                           <a:prstGeom prst="rect">
                             <a:avLst/>

</xml_diff>